<commit_message>
Added new books and updated search index
</commit_message>
<xml_diff>
--- a/main/dev/books/input/adda-suththa-03.docx
+++ b/main/dev/books/input/adda-suththa-03.docx
@@ -4,30 +4,6 @@
   <w:body>
     <w:p>
       <w:pPr>
-        <w:pStyle w:val="Title"/>
-        <w:rPr>
-          <w:lang w:bidi="si-LK"/>
-        </w:rPr>
-      </w:pPr>
-      <w:proofErr w:type="spellStart"/>
-      <w:r>
-        <w:rPr>
-          <w:cs/>
-          <w:lang w:bidi="si-LK"/>
-        </w:rPr>
-        <w:t>අද්ධා</w:t>
-      </w:r>
-      <w:proofErr w:type="spellEnd"/>
-      <w:r>
-        <w:rPr>
-          <w:cs/>
-          <w:lang w:bidi="si-LK"/>
-        </w:rPr>
-        <w:t xml:space="preserve"> සූත්‍රය</w:t>
-      </w:r>
-    </w:p>
-    <w:p>
-      <w:pPr>
         <w:pStyle w:val="Heading1"/>
         <w:rPr>
           <w:lang w:bidi="si-LK"/>
@@ -900,9 +876,8 @@
       </w:r>
       <w:r>
         <w:rPr>
-          <w:rStyle w:val="Heading2Char"/>
-          <w:cs/>
-          <w:lang w:bidi="si-LK"/>
+          <w:rStyle w:val="suththa-paliChar"/>
+          <w:cs/>
         </w:rPr>
         <w:t>කාලය</w:t>
       </w:r>

</xml_diff>